<commit_message>
Histoire T8 : révision d'après le FRP T8 officiel — ajout concile de Trente, traités de Westphalie 1648, Jacques Cartier 1534, Marco Polo, accords chefs locaux (traite) ; glossaire et chronologie enrichis ; livrable et Nos manuels mis à jour
Co-authored-by: arena-agent <297053741+arena-agent@users.noreply.github.com>
</commit_message>
<xml_diff>
--- a/manuel-histoire-t8/Manuel_Histoire_T8_UNITE2.docx
+++ b/manuel-histoire-t8/Manuel_Histoire_T8_UNITE2.docx
@@ -6102,7 +6102,7 @@
                 <w:szCs w:val="20"/>
                 <w:rFonts w:ascii="Times New Roman" w:cs="Times New Roman" w:eastAsia="Times New Roman" w:hAnsi="Times New Roman"/>
               </w:rPr>
-              <w:t xml:space="preserve">Donc, Facteurs : techniques (caravelle, boussole, astrolabe, cartes), économiques (routes, épices, métaux), politiques (terres nouvelles). Explorateurs : B. Diaz 1488 (cap de Bonne-Espérance), Colomb 1492 (Amérique), Vasco de Gama 1498 (Indes), Vespucci 1500, Diégo Diaz 1500 (Madagascar), Magellan 1519-1522 (tour du monde).</w:t>
+              <w:t xml:space="preserve">Donc, Facteurs : techniques (caravelle, boussole, astrolabe, cartes), économiques (routes, épices, métaux), politiques (terres nouvelles). Explorateurs : B. Diaz 1488 (cap de Bonne-Espérance), Colomb 1492 (Amérique), Vasco de Gama 1498 (Indes), Vespucci 1500, Diégo Diaz 1500 (Madagascar), Magellan 1519-1522 (tour du monde), Cartier 1534 (Canada, pour la France).</w:t>
             </w:r>
           </w:p>
         </w:tc>
@@ -6868,7 +6868,7 @@
           <w:szCs w:val="24"/>
           <w:rFonts w:ascii="Times New Roman" w:cs="Times New Roman" w:eastAsia="Times New Roman" w:hAnsi="Times New Roman"/>
         </w:rPr>
-        <w:t xml:space="preserve"> — sont longues, coûteuses et contrôlées par des intermédiaires ; après la prise de Constantinople par les Ottomans (1453), les Européens cherchent un chemin maritime direct vers les épices et les métaux précieux ;</w:t>
+        <w:t xml:space="preserve"> — sont longues, coûteuses et contrôlées par des intermédiaires ; après la prise de Constantinople par les Ottomans (1453), les Européens cherchent un chemin maritime direct vers les épices et les métaux précieux — rêvant des richesses de l’Asie décrites dès le XIIIᵉ siècle par le voyageur vénitien Marco Polo ;</w:t>
       </w:r>
     </w:p>
     <w:p>
@@ -7195,7 +7195,52 @@
           <w:szCs w:val="24"/>
           <w:rFonts w:ascii="Times New Roman" w:cs="Times New Roman" w:eastAsia="Times New Roman" w:hAnsi="Times New Roman"/>
         </w:rPr>
-        <w:t xml:space="preserve"> (1519-1522) réalise le premier tour du monde — preuve définitive que la Terre est ronde.</w:t>
+        <w:t xml:space="preserve"> (1519-1522) réalise le premier tour du monde — preuve définitive que la Terre est ronde ;</w:t>
+      </w:r>
+    </w:p>
+    <w:p>
+      <w:pPr>
+        <w:spacing w:after="60" w:line="300"/>
+        <w:jc w:val="both"/>
+      </w:pPr>
+      <w:r>
+        <w:rPr>
+          <w:b w:val="false"/>
+          <w:bCs w:val="false"/>
+          <w:i w:val="false"/>
+          <w:iCs w:val="false"/>
+          <w:color w:val="000000"/>
+          <w:sz w:val="24"/>
+          <w:szCs w:val="24"/>
+          <w:rFonts w:ascii="Times New Roman" w:cs="Times New Roman" w:eastAsia="Times New Roman" w:hAnsi="Times New Roman"/>
+        </w:rPr>
+        <w:t xml:space="preserve">• enfin, pour la France, </w:t>
+      </w:r>
+      <w:r>
+        <w:rPr>
+          <w:b/>
+          <w:bCs/>
+          <w:i w:val="false"/>
+          <w:iCs w:val="false"/>
+          <w:color w:val="1F4E79"/>
+          <w:sz w:val="24"/>
+          <w:szCs w:val="24"/>
+          <w:rFonts w:ascii="Times New Roman" w:cs="Times New Roman" w:eastAsia="Times New Roman" w:hAnsi="Times New Roman"/>
+        </w:rPr>
+        <w:t xml:space="preserve">Jacques Cartier</w:t>
+      </w:r>
+      <w:r>
+        <w:rPr>
+          <w:b w:val="false"/>
+          <w:bCs w:val="false"/>
+          <w:i w:val="false"/>
+          <w:iCs w:val="false"/>
+          <w:color w:val="000000"/>
+          <w:sz w:val="24"/>
+          <w:szCs w:val="24"/>
+          <w:rFonts w:ascii="Times New Roman" w:cs="Times New Roman" w:eastAsia="Times New Roman" w:hAnsi="Times New Roman"/>
+        </w:rPr>
+        <w:t xml:space="preserve"> explore en 1534 le Canada et le fleuve Saint-Laurent : toutes les grandes nations d’Europe sont désormais sur les mers.</w:t>
       </w:r>
     </w:p>
     <w:p>
@@ -10950,7 +10995,7 @@
           <w:szCs w:val="24"/>
           <w:rFonts w:ascii="Times New Roman" w:cs="Times New Roman" w:eastAsia="Times New Roman" w:hAnsi="Times New Roman"/>
         </w:rPr>
-        <w:t xml:space="preserve">Les causes de la traite : le besoin de main-d’œuvre en Amérique et les besoins des industries d’Europe. Ses conséquences : la </w:t>
+        <w:t xml:space="preserve">Les causes de la traite : le besoin de main-d’œuvre en Amérique, les besoins des premières industries d’Europe — et les accords conclus entre les trafiquants et certains chefs locaux d’Afrique, qui livraient des captifs contre des marchandises. Ses conséquences : la </w:t>
       </w:r>
       <w:r>
         <w:rPr>
@@ -13735,7 +13780,7 @@
                 <w:szCs w:val="20"/>
                 <w:rFonts w:ascii="Times New Roman" w:cs="Times New Roman" w:eastAsia="Times New Roman" w:hAnsi="Times New Roman"/>
               </w:rPr>
-              <w:t xml:space="preserve">Donc, Renaissance : renouveau des arts et sciences inspiré de l’Antiquité (Vinci, Copernic, Raphaël, Donatello, Michel-Ange). Réforme : origines = humanistes, perte de confiance envers l’Église, imprimerie ; acteurs = Luther, Calvin, Henri VIII ; résultats = protestantisme, anglicanisme, contre-réforme catholique.</w:t>
+              <w:t xml:space="preserve">Donc, Renaissance : renouveau des arts et sciences inspiré de l’Antiquité (Vinci, Copernic, Raphaël, Donatello, Michel-Ange). Réforme : origines = humanistes, perte de confiance envers l’Église, imprimerie ; acteurs = Luther, Calvin, Henri VIII ; résultats = protestantisme, anglicanisme, contre-réforme catholique (concile de Trente, 1545-1563) ; guerres de religion jusqu’aux traités de Westphalie (1648).</w:t>
             </w:r>
           </w:p>
         </w:tc>
@@ -14824,7 +14869,7 @@
           <w:szCs w:val="24"/>
           <w:rFonts w:ascii="Times New Roman" w:cs="Times New Roman" w:eastAsia="Times New Roman" w:hAnsi="Times New Roman"/>
         </w:rPr>
-        <w:t xml:space="preserve"> : discipline du clergé restaurée, nouveaux ordres religieux, reconquête des fidèles. La </w:t>
+        <w:t xml:space="preserve"> : au concile de Trente (1545-1563), elle restaure la discipline du clergé, précise sa doctrine et fonde de nouveaux ordres religieux pour reconquérir les fidèles. La </w:t>
       </w:r>
       <w:r>
         <w:rPr>
@@ -14877,6 +14922,25 @@
           <w:rFonts w:ascii="Times New Roman" w:cs="Times New Roman" w:eastAsia="Times New Roman" w:hAnsi="Times New Roman"/>
         </w:rPr>
         <w:t xml:space="preserve"> est la réponse catholique — l’une déclenche l’autre.</w:t>
+      </w:r>
+    </w:p>
+    <w:p>
+      <w:pPr>
+        <w:spacing w:after="100" w:line="300"/>
+        <w:jc w:val="both"/>
+      </w:pPr>
+      <w:r>
+        <w:rPr>
+          <w:b w:val="false"/>
+          <w:bCs w:val="false"/>
+          <w:i w:val="false"/>
+          <w:iCs w:val="false"/>
+          <w:color w:val="000000"/>
+          <w:sz w:val="24"/>
+          <w:szCs w:val="24"/>
+          <w:rFonts w:ascii="Times New Roman" w:cs="Times New Roman" w:eastAsia="Times New Roman" w:hAnsi="Times New Roman"/>
+        </w:rPr>
+        <w:t xml:space="preserve">La division religieuse dégénère en violences : pendant plus d’un siècle, guerres de religion et massacres déchirent la France, l’Angleterre et l’Empire allemand, jusqu’aux traités de Westphalie (1648) qui rétablissent la paix entre États catholiques et protestants.</w:t>
       </w:r>
     </w:p>
     <w:p>
@@ -15777,7 +15841,7 @@
           <w:szCs w:val="24"/>
           <w:rFonts w:ascii="Times New Roman" w:cs="Times New Roman" w:eastAsia="Times New Roman" w:hAnsi="Times New Roman"/>
         </w:rPr>
-        <w:t xml:space="preserve">a) l’influence des humanistes, la perte de confiance envers l’Église, l’imprimerie ; b) le luxe du clergé et la vente des indulgences ; d) l’anglicanisme, en rompant avec le pape ; e) par la contre-réforme : discipline restaurée, nouveaux ordres, reconquête des fidèles.</w:t>
+        <w:t xml:space="preserve">a) l’influence des humanistes, la perte de confiance envers l’Église, l’imprimerie ; b) le luxe du clergé et la vente des indulgences ; d) l’anglicanisme, en rompant avec le pape ; e) par la contre-réforme : concile de Trente (1545-1563), discipline restaurée, nouveaux ordres, reconquête des fidèles.</w:t>
       </w:r>
     </w:p>
     <w:p>

</xml_diff>

<commit_message>
Histoire T8 : révision FRP complète (Thématiques III-VI) — Tordesillas, Napoléon, Lumières, pacification, LMS 1818, indépendance
Co-authored-by: arena-agent <297053741+arena-agent@users.noreply.github.com>
</commit_message>
<xml_diff>
--- a/manuel-histoire-t8/Manuel_Histoire_T8_UNITE2.docx
+++ b/manuel-histoire-t8/Manuel_Histoire_T8_UNITE2.docx
@@ -10784,7 +10784,33 @@
           <w:szCs w:val="24"/>
           <w:rFonts w:ascii="Times New Roman" w:cs="Times New Roman" w:eastAsia="Times New Roman" w:hAnsi="Times New Roman"/>
         </w:rPr>
-        <w:t xml:space="preserve"> — escales commerciales fortifiées — le long de l’Afrique, en Inde et jusqu’en Chine.</w:t>
+        <w:t xml:space="preserve"> — escales commerciales fortifiées — le long de l’Afrique, en Inde et jusqu’en Chine. Ce partage du monde entre les deux couronnes avait même été fixé sur le papier dès 1494 par le traité de Tordesillas, qui traçait une ligne de séparation à travers l’</w:t>
+      </w:r>
+      <w:r>
+        <w:rPr>
+          <w:b/>
+          <w:bCs/>
+          <w:i w:val="false"/>
+          <w:iCs w:val="false"/>
+          <w:color w:val="1F4E79"/>
+          <w:sz w:val="24"/>
+          <w:szCs w:val="24"/>
+          <w:rFonts w:ascii="Times New Roman" w:cs="Times New Roman" w:eastAsia="Times New Roman" w:hAnsi="Times New Roman"/>
+        </w:rPr>
+        <w:t xml:space="preserve">Atlantique</w:t>
+      </w:r>
+      <w:r>
+        <w:rPr>
+          <w:b w:val="false"/>
+          <w:bCs w:val="false"/>
+          <w:i w:val="false"/>
+          <w:iCs w:val="false"/>
+          <w:color w:val="000000"/>
+          <w:sz w:val="24"/>
+          <w:szCs w:val="24"/>
+          <w:rFonts w:ascii="Times New Roman" w:cs="Times New Roman" w:eastAsia="Times New Roman" w:hAnsi="Times New Roman"/>
+        </w:rPr>
+        <w:t xml:space="preserve">.</w:t>
       </w:r>
     </w:p>
     <w:p>

</xml_diff>